<commit_message>
Benchmark: add ROADMAP (where Qore Code still fails and what is next), soften one unproven claim
</commit_message>
<xml_diff>
--- a/Qore-Code-Benchmark-2026-10-19.docx
+++ b/Qore-Code-Benchmark-2026-10-19.docx
@@ -3752,7 +3752,15 @@
         <w:pStyle w:val="ListBullet"/>
       </w:pPr>
       <w:r>
-        <w:t>No 70B dense coder model with tool calling exists, so Llama 3.3 70B Instruct is the 70B dense model. All three tools struggled with it, mostly writing nothing.</w:t>
+        <w:t>We did not find a 70B dense coding model with tool calling in Ollama's model library, so the 70B dense model is Llama 3.3 70B Instruct, a general model. All three tools struggled with it, mostly writing nothing.</w:t>
+      </w:r>
+    </w:p>
+    <w:p>
+      <w:pPr>
+        <w:pStyle w:val="ListBullet"/>
+      </w:pPr>
+      <w:r>
+        <w:t>Where Qore Code still fails, why (from its own run logs), and what we are fixing next: ROADMAP.md in the same repository.</w:t>
       </w:r>
     </w:p>
     <w:p>

</xml_diff>

<commit_message>
Benchmark: corrected grading, 14/9/10
Six grader mistakes fixed, every row of every tool re-graded. All changes were fail to pass. ROADMAP updated.
</commit_message>
<xml_diff>
--- a/Qore-Code-Benchmark-2026-10-19.docx
+++ b/Qore-Code-Benchmark-2026-10-19.docx
@@ -12,7 +12,7 @@
     </w:p>
     <w:p>
       <w:r>
-        <w:t>Local coding agents, same local Q8 models, same plain-language prompts — measured 2026-10-19.</w:t>
+        <w:t>Local coding agents, same local Q8 models, same plain-language prompts — measured 2026-10-19, grading corrected 2026-10-20 (see Notes).</w:t>
       </w:r>
     </w:p>
     <w:p>
@@ -111,7 +111,7 @@
           </w:tcPr>
           <w:p>
             <w:r>
-              <w:t>12</w:t>
+              <w:t>14</w:t>
             </w:r>
           </w:p>
         </w:tc>
@@ -131,7 +131,7 @@
           </w:tcPr>
           <w:p>
             <w:r>
-              <w:t>50%</w:t>
+              <w:t>58%</w:t>
             </w:r>
           </w:p>
         </w:tc>
@@ -153,7 +153,7 @@
           </w:tcPr>
           <w:p>
             <w:r>
-              <w:t>7</w:t>
+              <w:t>9</w:t>
             </w:r>
           </w:p>
         </w:tc>
@@ -173,7 +173,7 @@
           </w:tcPr>
           <w:p>
             <w:r>
-              <w:t>29%</w:t>
+              <w:t>38%</w:t>
             </w:r>
           </w:p>
         </w:tc>
@@ -195,7 +195,7 @@
           </w:tcPr>
           <w:p>
             <w:r>
-              <w:t>7</w:t>
+              <w:t>10</w:t>
             </w:r>
           </w:p>
         </w:tc>
@@ -215,7 +215,7 @@
           </w:tcPr>
           <w:p>
             <w:r>
-              <w:t>29%</w:t>
+              <w:t>42%</w:t>
             </w:r>
           </w:p>
         </w:tc>
@@ -909,11 +909,44 @@
         <w:tc>
           <w:tcPr>
             <w:tcW w:type="dxa" w:w="1728"/>
-            <w:shd w:val="clear" w:color="auto" w:fill="FFC7CE"/>
-          </w:tcPr>
-          <w:p>
-            <w:r>
-              <w:t>fail · 190s</w:t>
+            <w:shd w:val="clear" w:color="auto" w:fill="C6EFCE"/>
+          </w:tcPr>
+          <w:p>
+            <w:r>
+              <w:t>PASS · 190s</w:t>
+            </w:r>
+          </w:p>
+        </w:tc>
+        <w:tc>
+          <w:tcPr>
+            <w:tcW w:type="dxa" w:w="1728"/>
+            <w:shd w:val="clear" w:color="auto" w:fill="C6EFCE"/>
+          </w:tcPr>
+          <w:p>
+            <w:r>
+              <w:t>PASS · 118s</w:t>
+            </w:r>
+          </w:p>
+        </w:tc>
+      </w:tr>
+      <w:tr>
+        <w:tc>
+          <w:tcPr>
+            <w:tcW w:type="dxa" w:w="1728"/>
+          </w:tcPr>
+          <w:p>
+            <w:r>
+              <w:t>Semi-complex app: notes with search + save</w:t>
+            </w:r>
+          </w:p>
+        </w:tc>
+        <w:tc>
+          <w:tcPr>
+            <w:tcW w:type="dxa" w:w="1728"/>
+          </w:tcPr>
+          <w:p>
+            <w:r>
+              <w:t>Qwen3-Coder-Next 80B (MoE)</w:t>
             </w:r>
           </w:p>
         </w:tc>
@@ -924,7 +957,29 @@
           </w:tcPr>
           <w:p>
             <w:r>
-              <w:t>fail · 118s</w:t>
+              <w:t>fail · 273s</w:t>
+            </w:r>
+          </w:p>
+        </w:tc>
+        <w:tc>
+          <w:tcPr>
+            <w:tcW w:type="dxa" w:w="1728"/>
+            <w:shd w:val="clear" w:color="auto" w:fill="FFC7CE"/>
+          </w:tcPr>
+          <w:p>
+            <w:r>
+              <w:t>fail · 331s</w:t>
+            </w:r>
+          </w:p>
+        </w:tc>
+        <w:tc>
+          <w:tcPr>
+            <w:tcW w:type="dxa" w:w="1728"/>
+            <w:shd w:val="clear" w:color="auto" w:fill="C6EFCE"/>
+          </w:tcPr>
+          <w:p>
+            <w:r>
+              <w:t>PASS · 98s</w:t>
             </w:r>
           </w:p>
         </w:tc>
@@ -946,7 +1001,18 @@
           </w:tcPr>
           <w:p>
             <w:r>
-              <w:t>Qwen3-Coder-Next 80B (MoE)</w:t>
+              <w:t>Llama 3.3 70B (dense)</w:t>
+            </w:r>
+          </w:p>
+        </w:tc>
+        <w:tc>
+          <w:tcPr>
+            <w:tcW w:type="dxa" w:w="1728"/>
+            <w:shd w:val="clear" w:color="auto" w:fill="C6EFCE"/>
+          </w:tcPr>
+          <w:p>
+            <w:r>
+              <w:t>PASS · 104s</w:t>
             </w:r>
           </w:p>
         </w:tc>
@@ -957,7 +1023,7 @@
           </w:tcPr>
           <w:p>
             <w:r>
-              <w:t>fail · 273s</w:t>
+              <w:t>fail · 107s</w:t>
             </w:r>
           </w:p>
         </w:tc>
@@ -968,7 +1034,40 @@
           </w:tcPr>
           <w:p>
             <w:r>
-              <w:t>fail · 331s</w:t>
+              <w:t>fail · 102s</w:t>
+            </w:r>
+          </w:p>
+        </w:tc>
+      </w:tr>
+      <w:tr>
+        <w:tc>
+          <w:tcPr>
+            <w:tcW w:type="dxa" w:w="1728"/>
+          </w:tcPr>
+          <w:p>
+            <w:r>
+              <w:t>2D game: jump over obstacles</w:t>
+            </w:r>
+          </w:p>
+        </w:tc>
+        <w:tc>
+          <w:tcPr>
+            <w:tcW w:type="dxa" w:w="1728"/>
+          </w:tcPr>
+          <w:p>
+            <w:r>
+              <w:t>Qwen3-Coder 30B-A3B (MoE)</w:t>
+            </w:r>
+          </w:p>
+        </w:tc>
+        <w:tc>
+          <w:tcPr>
+            <w:tcW w:type="dxa" w:w="1728"/>
+            <w:shd w:val="clear" w:color="auto" w:fill="C6EFCE"/>
+          </w:tcPr>
+          <w:p>
+            <w:r>
+              <w:t>PASS · 600s (cap)</w:t>
             </w:r>
           </w:p>
         </w:tc>
@@ -979,7 +1078,18 @@
           </w:tcPr>
           <w:p>
             <w:r>
-              <w:t>fail · 98s</w:t>
+              <w:t>fail · 38s</w:t>
+            </w:r>
+          </w:p>
+        </w:tc>
+        <w:tc>
+          <w:tcPr>
+            <w:tcW w:type="dxa" w:w="1728"/>
+            <w:shd w:val="clear" w:color="auto" w:fill="C6EFCE"/>
+          </w:tcPr>
+          <w:p>
+            <w:r>
+              <w:t>PASS · 74s</w:t>
             </w:r>
           </w:p>
         </w:tc>
@@ -991,7 +1101,7 @@
           </w:tcPr>
           <w:p>
             <w:r>
-              <w:t>Semi-complex app: notes with search + save</w:t>
+              <w:t>2D game: jump over obstacles</w:t>
             </w:r>
           </w:p>
         </w:tc>
@@ -1001,7 +1111,7 @@
           </w:tcPr>
           <w:p>
             <w:r>
-              <w:t>Llama 3.3 70B (dense)</w:t>
+              <w:t>Qwen3-Coder-Next 80B (MoE)</w:t>
             </w:r>
           </w:p>
         </w:tc>
@@ -1012,73 +1122,7 @@
           </w:tcPr>
           <w:p>
             <w:r>
-              <w:t>PASS · 104s</w:t>
-            </w:r>
-          </w:p>
-        </w:tc>
-        <w:tc>
-          <w:tcPr>
-            <w:tcW w:type="dxa" w:w="1728"/>
-            <w:shd w:val="clear" w:color="auto" w:fill="FFC7CE"/>
-          </w:tcPr>
-          <w:p>
-            <w:r>
-              <w:t>fail · 107s</w:t>
-            </w:r>
-          </w:p>
-        </w:tc>
-        <w:tc>
-          <w:tcPr>
-            <w:tcW w:type="dxa" w:w="1728"/>
-            <w:shd w:val="clear" w:color="auto" w:fill="FFC7CE"/>
-          </w:tcPr>
-          <w:p>
-            <w:r>
-              <w:t>fail · 102s</w:t>
-            </w:r>
-          </w:p>
-        </w:tc>
-      </w:tr>
-      <w:tr>
-        <w:tc>
-          <w:tcPr>
-            <w:tcW w:type="dxa" w:w="1728"/>
-          </w:tcPr>
-          <w:p>
-            <w:r>
-              <w:t>2D game: jump over obstacles</w:t>
-            </w:r>
-          </w:p>
-        </w:tc>
-        <w:tc>
-          <w:tcPr>
-            <w:tcW w:type="dxa" w:w="1728"/>
-          </w:tcPr>
-          <w:p>
-            <w:r>
-              <w:t>Qwen3-Coder 30B-A3B (MoE)</w:t>
-            </w:r>
-          </w:p>
-        </w:tc>
-        <w:tc>
-          <w:tcPr>
-            <w:tcW w:type="dxa" w:w="1728"/>
-            <w:shd w:val="clear" w:color="auto" w:fill="FFC7CE"/>
-          </w:tcPr>
-          <w:p>
-            <w:r>
-              <w:t>fail · 600s (cap)</w:t>
-            </w:r>
-          </w:p>
-        </w:tc>
-        <w:tc>
-          <w:tcPr>
-            <w:tcW w:type="dxa" w:w="1728"/>
-            <w:shd w:val="clear" w:color="auto" w:fill="FFC7CE"/>
-          </w:tcPr>
-          <w:p>
-            <w:r>
-              <w:t>fail · 38s</w:t>
+              <w:t>PASS · 228s</w:t>
             </w:r>
           </w:p>
         </w:tc>
@@ -1089,62 +1133,18 @@
           </w:tcPr>
           <w:p>
             <w:r>
-              <w:t>PASS · 74s</w:t>
-            </w:r>
-          </w:p>
-        </w:tc>
-      </w:tr>
-      <w:tr>
+              <w:t>PASS · 38s</w:t>
+            </w:r>
+          </w:p>
+        </w:tc>
         <w:tc>
           <w:tcPr>
             <w:tcW w:type="dxa" w:w="1728"/>
-          </w:tcPr>
-          <w:p>
-            <w:r>
-              <w:t>2D game: jump over obstacles</w:t>
-            </w:r>
-          </w:p>
-        </w:tc>
-        <w:tc>
-          <w:tcPr>
-            <w:tcW w:type="dxa" w:w="1728"/>
-          </w:tcPr>
-          <w:p>
-            <w:r>
-              <w:t>Qwen3-Coder-Next 80B (MoE)</w:t>
-            </w:r>
-          </w:p>
-        </w:tc>
-        <w:tc>
-          <w:tcPr>
-            <w:tcW w:type="dxa" w:w="1728"/>
-            <w:shd w:val="clear" w:color="auto" w:fill="FFC7CE"/>
-          </w:tcPr>
-          <w:p>
-            <w:r>
-              <w:t>fail · 228s</w:t>
-            </w:r>
-          </w:p>
-        </w:tc>
-        <w:tc>
-          <w:tcPr>
-            <w:tcW w:type="dxa" w:w="1728"/>
-            <w:shd w:val="clear" w:color="auto" w:fill="FFC7CE"/>
-          </w:tcPr>
-          <w:p>
-            <w:r>
-              <w:t>fail · 38s</w:t>
-            </w:r>
-          </w:p>
-        </w:tc>
-        <w:tc>
-          <w:tcPr>
-            <w:tcW w:type="dxa" w:w="1728"/>
-            <w:shd w:val="clear" w:color="auto" w:fill="FFC7CE"/>
-          </w:tcPr>
-          <w:p>
-            <w:r>
-              <w:t>fail · 29s</w:t>
+            <w:shd w:val="clear" w:color="auto" w:fill="C6EFCE"/>
+          </w:tcPr>
+          <w:p>
+            <w:r>
+              <w:t>PASS · 29s</w:t>
             </w:r>
           </w:p>
         </w:tc>
@@ -2058,7 +2058,7 @@
           </w:tcPr>
           <w:p>
             <w:r>
-              <w:t>5 / 6</w:t>
+              <w:t>6 / 6</w:t>
             </w:r>
           </w:p>
         </w:tc>
@@ -2068,17 +2068,17 @@
           </w:tcPr>
           <w:p>
             <w:r>
+              <w:t>4 / 6</w:t>
+            </w:r>
+          </w:p>
+        </w:tc>
+        <w:tc>
+          <w:tcPr>
+            <w:tcW w:type="dxa" w:w="2160"/>
+          </w:tcPr>
+          <w:p>
+            <w:r>
               <w:t>3 / 6</w:t>
-            </w:r>
-          </w:p>
-        </w:tc>
-        <w:tc>
-          <w:tcPr>
-            <w:tcW w:type="dxa" w:w="2160"/>
-          </w:tcPr>
-          <w:p>
-            <w:r>
-              <w:t>2 / 6</w:t>
             </w:r>
           </w:p>
         </w:tc>
@@ -2100,6 +2100,16 @@
           </w:tcPr>
           <w:p>
             <w:r>
+              <w:t>6 / 9</w:t>
+            </w:r>
+          </w:p>
+        </w:tc>
+        <w:tc>
+          <w:tcPr>
+            <w:tcW w:type="dxa" w:w="2160"/>
+          </w:tcPr>
+          <w:p>
+            <w:r>
               <w:t>5 / 9</w:t>
             </w:r>
           </w:p>
@@ -2110,17 +2120,7 @@
           </w:tcPr>
           <w:p>
             <w:r>
-              <w:t>4 / 9</w:t>
-            </w:r>
-          </w:p>
-        </w:tc>
-        <w:tc>
-          <w:tcPr>
-            <w:tcW w:type="dxa" w:w="2160"/>
-          </w:tcPr>
-          <w:p>
-            <w:r>
-              <w:t>5 / 9</w:t>
+              <w:t>7 / 9</w:t>
             </w:r>
           </w:p>
         </w:tc>
@@ -2508,11 +2508,11 @@
         <w:tc>
           <w:tcPr>
             <w:tcW w:type="dxa" w:w="2160"/>
-            <w:shd w:val="clear" w:color="auto" w:fill="FFC7CE"/>
-          </w:tcPr>
-          <w:p>
-            <w:r>
-              <w:t>fail · 531s</w:t>
+            <w:shd w:val="clear" w:color="auto" w:fill="C6EFCE"/>
+          </w:tcPr>
+          <w:p>
+            <w:r>
+              <w:t>PASS · 531s</w:t>
             </w:r>
           </w:p>
         </w:tc>
@@ -2541,11 +2541,11 @@
         <w:tc>
           <w:tcPr>
             <w:tcW w:type="dxa" w:w="2160"/>
-            <w:shd w:val="clear" w:color="auto" w:fill="FFC7CE"/>
-          </w:tcPr>
-          <w:p>
-            <w:r>
-              <w:t>fail · 600s (cap)</w:t>
+            <w:shd w:val="clear" w:color="auto" w:fill="C6EFCE"/>
+          </w:tcPr>
+          <w:p>
+            <w:r>
+              <w:t>PASS · 600s (cap)</w:t>
             </w:r>
           </w:p>
         </w:tc>
@@ -2585,22 +2585,22 @@
         <w:tc>
           <w:tcPr>
             <w:tcW w:type="dxa" w:w="2160"/>
-            <w:shd w:val="clear" w:color="auto" w:fill="FFC7CE"/>
-          </w:tcPr>
-          <w:p>
-            <w:r>
-              <w:t>fail · 228s</w:t>
+            <w:shd w:val="clear" w:color="auto" w:fill="C6EFCE"/>
+          </w:tcPr>
+          <w:p>
+            <w:r>
+              <w:t>PASS · 228s</w:t>
             </w:r>
           </w:p>
         </w:tc>
         <w:tc>
           <w:tcPr>
             <w:tcW w:type="dxa" w:w="2160"/>
-            <w:shd w:val="clear" w:color="auto" w:fill="FFC7CE"/>
-          </w:tcPr>
-          <w:p>
-            <w:r>
-              <w:t>fail · 173s</w:t>
+            <w:shd w:val="clear" w:color="auto" w:fill="C6EFCE"/>
+          </w:tcPr>
+          <w:p>
+            <w:r>
+              <w:t>PASS · 173s</w:t>
             </w:r>
           </w:p>
         </w:tc>
@@ -2961,7 +2961,7 @@
     <w:p/>
     <w:p>
       <w:r>
-        <w:t>Passed on these 16 runs: shipped build 10, fixed build 9.</w:t>
+        <w:t>Passed on these 16 runs: shipped build 12, fixed build 11.</w:t>
       </w:r>
     </w:p>
     <w:tbl>
@@ -3355,7 +3355,7 @@
           </w:tcPr>
           <w:p>
             <w:r>
-              <w:t>image tool used: no; game works: no</w:t>
+              <w:t>image tool used: no; game works: yes</w:t>
             </w:r>
           </w:p>
         </w:tc>
@@ -3407,7 +3407,7 @@
           </w:tcPr>
           <w:p>
             <w:r>
-              <w:t>image tool used: no; game works: no</w:t>
+              <w:t>image tool used: no; game works: yes</w:t>
             </w:r>
           </w:p>
         </w:tc>
@@ -3511,7 +3511,7 @@
           </w:tcPr>
           <w:p>
             <w:r>
-              <w:t>image tool used: no; game works: no</w:t>
+              <w:t>image tool used: no; game works: yes</w:t>
             </w:r>
           </w:p>
         </w:tc>
@@ -3606,7 +3606,7 @@
           </w:tcPr>
           <w:p>
             <w:r>
-              <w:t>Filled the real fields and pressed Save (window apps) or typed the usual commands (terminal apps), restarted the app and checked the entry was still there</w:t>
+              <w:t>Pressed New first if there was such a button, filled the real fields, pressed Save, closed the window with its close button (window apps), or typed the usual commands (terminal apps), restarted the app and checked the entry was still there</w:t>
             </w:r>
           </w:p>
         </w:tc>
@@ -3650,7 +3650,7 @@
           </w:tcPr>
           <w:p>
             <w:r>
-              <w:t>Started the game the way the agent told the user to (its own run instruction, or the Godot project where it is), pressed Space/Enter like a player, moved, jumped, screenshotted; a vision model judged it</w:t>
+              <w:t>Started the game the way the agent told the user to (its own run instruction, or the Godot project where it is), pressed Space/Enter like a player (keys held 0.15 s), moved, jumped, screenshotted; a vision model judged it. A 2D game was played up to three times from a fresh start (run then jump; jump at once; Space to start, then jump); a pass in any counts</w:t>
             </w:r>
           </w:p>
         </w:tc>
@@ -3736,7 +3736,15 @@
         <w:pStyle w:val="ListBullet"/>
       </w:pPr>
       <w:r>
-        <w:t>After both runs, checking the grader's screenshots by hand showed three grader mistakes: a Godot project in a subfolder was opened in the wrong place, a Python virtual environment with an unusual name was not skipped, and a Python app was not always started the way the agent told the user to start it. The grader was fixed and EVERY row of both runs was graded again from the files the tools left behind; the tables show those grades. No tool run was repeated or edited for this. The re-grade changed two verdicts: Qore Code's 2D game on Qwen3-Coder 30B (fixed run) became a pass because the grader now starts the file the agent said to run; and Qwen Code's 3D game on Qwen3-Coder-Next 80B failed the second time although its grading did not change at all — a real-time game played blind for a few seconds can go either way, and the first grading saw its pickup counter go from 0 to 2, so it is kept as a pass.</w:t>
+        <w:t>Corrected 2026-10-20. Checking the grader by hand found six grader mistakes, all fixed, and EVERY row of both runs was graded again from the files the tools left behind (no tool run was repeated or edited). First three: a Godot project in a subfolder was opened in the wrong place, a Python virtual environment with an unusual name was not skipped, and a Python app was not always started the way the agent told the user to start it. Then three more: (1) in a notes app the grader typed a note and only then pressed "New Note", which threw the note away — it now presses New first, like a person, and closes a window with its close button; (2) it waited about 4 seconds before playing a 2D game, by which time a fast game was already over — it now also plays from the first frame; (3) its key presses lasted a millisecond, too short for games that check whether a key is held — keys are now held 0.15 s. Every change these fixes made was from fail to pass: opencode 2, Qwen Code 2, Qore Code 2 in the three-tool table, and Qore Code 2 in the fixed-build table. The first published version of this report (2026-10-19) had 12 / 7 / 7.</w:t>
+      </w:r>
+    </w:p>
+    <w:p>
+      <w:pPr>
+        <w:pStyle w:val="ListBullet"/>
+      </w:pPr>
+      <w:r>
+        <w:t>Two Qwen Code rows are counted as passes by a person checking the evidence, both in Qwen Code's favour: its 2D game on Qwen3-Coder-Next 80B (the vision judge said the player did not move; running the same grader by hand showed the player in the air after Space), and its 3D game on the same model (the first grading saw its pickup counter go from 0 to 2; later gradings of the same files did not — a real-time game played blind for a few seconds can go either way).</w:t>
       </w:r>
     </w:p>
     <w:p>

</xml_diff>

<commit_message>
Roadmap and report: plainer wording
</commit_message>
<xml_diff>
--- a/Qore-Code-Benchmark-2026-10-19.docx
+++ b/Qore-Code-Benchmark-2026-10-19.docx
@@ -3736,7 +3736,7 @@
         <w:pStyle w:val="ListBullet"/>
       </w:pPr>
       <w:r>
-        <w:t>Corrected 2026-10-20. Checking the grader by hand found six grader mistakes, all fixed, and EVERY row of both runs was graded again from the files the tools left behind (no tool run was repeated or edited). First three: a Godot project in a subfolder was opened in the wrong place, a Python virtual environment with an unusual name was not skipped, and a Python app was not always started the way the agent told the user to start it. Then three more: (1) in a notes app the grader typed a note and only then pressed "New Note", which threw the note away — it now presses New first, like a person, and closes a window with its close button; (2) it waited about 4 seconds before playing a 2D game, by which time a fast game was already over — it now also plays from the first frame; (3) its key presses lasted a millisecond, too short for games that check whether a key is held — keys are now held 0.15 s. Every change these fixes made was from fail to pass: opencode 2, Qwen Code 2, Qore Code 2 in the three-tool table, and Qore Code 2 in the fixed-build table. The first published version of this report (2026-10-19) had 12 / 7 / 7.</w:t>
+        <w:t>Corrected 2026-10-20. Checking the grader by hand found six grader mistakes, all fixed, and EVERY row of both runs was graded again from the files the tools left behind (no tool run was repeated or edited). First three: a Godot project in a subfolder was opened in the wrong place, a Python virtual environment with an unusual name was not skipped, and a Python app was not always started the way the agent told the user to start it. Then three more: (1) in a notes app the grader typed a note and only then pressed "New Note", which threw the note away — it now presses New first and closes the window with its close button; (2) it waited about 4 seconds before playing a 2D game, by which time a fast game was already over — it now also plays from the first frame; (3) its key presses lasted a millisecond, too short for games that check whether a key is held — keys are now held 0.15 s. Every change these fixes made was from fail to pass: opencode 2, Qwen Code 2, Qore Code 2 in the three-tool table, and Qore Code 2 in the fixed-build table. The first published version of this report (2026-10-19) had 12 / 7 / 7.</w:t>
       </w:r>
     </w:p>
     <w:p>
@@ -3744,7 +3744,7 @@
         <w:pStyle w:val="ListBullet"/>
       </w:pPr>
       <w:r>
-        <w:t>Two Qwen Code rows are counted as passes by a person checking the evidence, both in Qwen Code's favour: its 2D game on Qwen3-Coder-Next 80B (the vision judge said the player did not move; running the same grader by hand showed the player in the air after Space), and its 3D game on the same model (the first grading saw its pickup counter go from 0 to 2; later gradings of the same files did not — a real-time game played blind for a few seconds can go either way).</w:t>
+        <w:t>Two Qwen Code rows are counted as passes after a manual check of the evidence, both in Qwen Code's favour: its 2D game on Qwen3-Coder-Next 80B (the vision judge said the player did not move; running the same grader by hand showed the player in the air after Space), and its 3D game on the same model (the first grading saw its pickup counter go from 0 to 2; later gradings of the same files did not — a real-time game played blind for a few seconds can go either way).</w:t>
       </w:r>
     </w:p>
     <w:p>

</xml_diff>

<commit_message>
Update README, roadmap and report for 2026.10.20
</commit_message>
<xml_diff>
--- a/Qore-Code-Benchmark-2026-10-19.docx
+++ b/Qore-Code-Benchmark-2026-10-19.docx
@@ -425,7 +425,7 @@
           </w:tcPr>
           <w:p>
             <w:r>
-              <w:t>written the way a non-programmer would ask — see the last section</w:t>
+              <w:t>plain, non-technical requests — see the last section</w:t>
             </w:r>
           </w:p>
         </w:tc>
@@ -3650,7 +3650,7 @@
           </w:tcPr>
           <w:p>
             <w:r>
-              <w:t>Started the game the way the agent told the user to (its own run instruction, or the Godot project where it is), pressed Space/Enter like a player (keys held 0.15 s), moved, jumped, screenshotted; a vision model judged it. A 2D game was played up to three times from a fresh start (run then jump; jump at once; Space to start, then jump); a pass in any counts</w:t>
+              <w:t>Started the game with the agent's own run instruction (or the Godot project where it is), pressed Space/Enter (keys held 0.15 s), moved, jumped, screenshotted; a vision model judged it. A 2D game was played up to three times from a fresh start (run then jump; jump at once; Space to start, then jump); a pass in any counts</w:t>
             </w:r>
           </w:p>
         </w:tc>
@@ -3736,7 +3736,7 @@
         <w:pStyle w:val="ListBullet"/>
       </w:pPr>
       <w:r>
-        <w:t>Corrected 2026-10-20. Checking the grader by hand found six grader mistakes, all fixed, and EVERY row of both runs was graded again from the files the tools left behind (no tool run was repeated or edited). First three: a Godot project in a subfolder was opened in the wrong place, a Python virtual environment with an unusual name was not skipped, and a Python app was not always started the way the agent told the user to start it. Then three more: (1) in a notes app the grader typed a note and only then pressed "New Note", which threw the note away — it now presses New first and closes the window with its close button; (2) it waited about 4 seconds before playing a 2D game, by which time a fast game was already over — it now also plays from the first frame; (3) its key presses lasted a millisecond, too short for games that check whether a key is held — keys are now held 0.15 s. Every change these fixes made was from fail to pass: opencode 2, Qwen Code 2, Qore Code 2 in the three-tool table, and Qore Code 2 in the fixed-build table. The first published version of this report (2026-10-19) had 12 / 7 / 7.</w:t>
+        <w:t>Corrected 2026-10-20. Checking the grader by hand found six grader mistakes, all fixed, and EVERY row of both runs was graded again from the files the tools left behind (no tool run was repeated or edited). First three: a Godot project in a subfolder was opened in the wrong place, a Python virtual environment with an unusual name was not skipped, and a Python app was not always started with the agent's own run instruction. Then three more: (1) in a notes app the grader typed a note and only then pressed "New Note", which threw the note away — it now presses New first and closes the window with its close button; (2) it waited about 4 seconds before playing a 2D game, by which time a fast game was already over — it now also plays from the first frame; (3) its key presses lasted a millisecond, too short for games that check whether a key is held — keys are now held 0.15 s. Every change these fixes made was from fail to pass: opencode 2, Qwen Code 2, Qore Code 2 in the three-tool table, and Qore Code 2 in the fixed-build table. The first published version of this report (2026-10-19) had 12 / 7 / 7.</w:t>
       </w:r>
     </w:p>
     <w:p>

</xml_diff>

<commit_message>
Benchmark report: model names with their quants
</commit_message>
<xml_diff>
--- a/Qore-Code-Benchmark-2026-10-19.docx
+++ b/Qore-Code-Benchmark-2026-10-19.docx
@@ -337,7 +337,7 @@
           </w:tcPr>
           <w:p>
             <w:r>
-              <w:t>Qwen3-Coder 30B-A3B Q8 · Qwen3-Coder-Next 80B Q8 (MoE) · Llama 3.3 70B Instruct Q8 (dense)</w:t>
+              <w:t>Qwen3-Coder 30B-A3B Q8_0 · Qwen3-Coder-Next 80B Q8_0 (MoE) · Llama 3.3 70B Instruct Q8_0 (dense)</w:t>
             </w:r>
           </w:p>
         </w:tc>
@@ -561,7 +561,7 @@
           </w:tcPr>
           <w:p>
             <w:r>
-              <w:t>Qwen3-Coder 30B-A3B (MoE)</w:t>
+              <w:t>Qwen3-Coder 30B-A3B Q8_0 (MoE)</w:t>
             </w:r>
           </w:p>
         </w:tc>
@@ -616,7 +616,7 @@
           </w:tcPr>
           <w:p>
             <w:r>
-              <w:t>Qwen3-Coder-Next 80B (MoE)</w:t>
+              <w:t>Qwen3-Coder-Next 80B Q8_0 (MoE)</w:t>
             </w:r>
           </w:p>
         </w:tc>
@@ -671,7 +671,7 @@
           </w:tcPr>
           <w:p>
             <w:r>
-              <w:t>Llama 3.3 70B (dense)</w:t>
+              <w:t>Llama 3.3 70B Q8_0 (dense)</w:t>
             </w:r>
           </w:p>
         </w:tc>
@@ -726,7 +726,7 @@
           </w:tcPr>
           <w:p>
             <w:r>
-              <w:t>Qwen3-Coder 30B-A3B (MoE)</w:t>
+              <w:t>Qwen3-Coder 30B-A3B Q8_0 (MoE)</w:t>
             </w:r>
           </w:p>
         </w:tc>
@@ -781,7 +781,7 @@
           </w:tcPr>
           <w:p>
             <w:r>
-              <w:t>Qwen3-Coder-Next 80B (MoE)</w:t>
+              <w:t>Qwen3-Coder-Next 80B Q8_0 (MoE)</w:t>
             </w:r>
           </w:p>
         </w:tc>
@@ -836,7 +836,7 @@
           </w:tcPr>
           <w:p>
             <w:r>
-              <w:t>Llama 3.3 70B (dense)</w:t>
+              <w:t>Llama 3.3 70B Q8_0 (dense)</w:t>
             </w:r>
           </w:p>
         </w:tc>
@@ -891,7 +891,7 @@
           </w:tcPr>
           <w:p>
             <w:r>
-              <w:t>Qwen3-Coder 30B-A3B (MoE)</w:t>
+              <w:t>Qwen3-Coder 30B-A3B Q8_0 (MoE)</w:t>
             </w:r>
           </w:p>
         </w:tc>
@@ -946,7 +946,7 @@
           </w:tcPr>
           <w:p>
             <w:r>
-              <w:t>Qwen3-Coder-Next 80B (MoE)</w:t>
+              <w:t>Qwen3-Coder-Next 80B Q8_0 (MoE)</w:t>
             </w:r>
           </w:p>
         </w:tc>
@@ -1001,7 +1001,7 @@
           </w:tcPr>
           <w:p>
             <w:r>
-              <w:t>Llama 3.3 70B (dense)</w:t>
+              <w:t>Llama 3.3 70B Q8_0 (dense)</w:t>
             </w:r>
           </w:p>
         </w:tc>
@@ -1056,7 +1056,7 @@
           </w:tcPr>
           <w:p>
             <w:r>
-              <w:t>Qwen3-Coder 30B-A3B (MoE)</w:t>
+              <w:t>Qwen3-Coder 30B-A3B Q8_0 (MoE)</w:t>
             </w:r>
           </w:p>
         </w:tc>
@@ -1111,7 +1111,7 @@
           </w:tcPr>
           <w:p>
             <w:r>
-              <w:t>Qwen3-Coder-Next 80B (MoE)</w:t>
+              <w:t>Qwen3-Coder-Next 80B Q8_0 (MoE)</w:t>
             </w:r>
           </w:p>
         </w:tc>
@@ -1166,7 +1166,7 @@
           </w:tcPr>
           <w:p>
             <w:r>
-              <w:t>Llama 3.3 70B (dense)</w:t>
+              <w:t>Llama 3.3 70B Q8_0 (dense)</w:t>
             </w:r>
           </w:p>
         </w:tc>
@@ -1221,7 +1221,7 @@
           </w:tcPr>
           <w:p>
             <w:r>
-              <w:t>Qwen3-Coder 30B-A3B (MoE)</w:t>
+              <w:t>Qwen3-Coder 30B-A3B Q8_0 (MoE)</w:t>
             </w:r>
           </w:p>
         </w:tc>
@@ -1276,7 +1276,7 @@
           </w:tcPr>
           <w:p>
             <w:r>
-              <w:t>Qwen3-Coder-Next 80B (MoE)</w:t>
+              <w:t>Qwen3-Coder-Next 80B Q8_0 (MoE)</w:t>
             </w:r>
           </w:p>
         </w:tc>
@@ -1331,7 +1331,7 @@
           </w:tcPr>
           <w:p>
             <w:r>
-              <w:t>Llama 3.3 70B (dense)</w:t>
+              <w:t>Llama 3.3 70B Q8_0 (dense)</w:t>
             </w:r>
           </w:p>
         </w:tc>
@@ -1386,7 +1386,7 @@
           </w:tcPr>
           <w:p>
             <w:r>
-              <w:t>Qwen3-Coder 30B-A3B (MoE)</w:t>
+              <w:t>Qwen3-Coder 30B-A3B Q8_0 (MoE)</w:t>
             </w:r>
           </w:p>
         </w:tc>
@@ -1441,7 +1441,7 @@
           </w:tcPr>
           <w:p>
             <w:r>
-              <w:t>Qwen3-Coder-Next 80B (MoE)</w:t>
+              <w:t>Qwen3-Coder-Next 80B Q8_0 (MoE)</w:t>
             </w:r>
           </w:p>
         </w:tc>
@@ -1496,7 +1496,7 @@
           </w:tcPr>
           <w:p>
             <w:r>
-              <w:t>Llama 3.3 70B (dense)</w:t>
+              <w:t>Llama 3.3 70B Q8_0 (dense)</w:t>
             </w:r>
           </w:p>
         </w:tc>
@@ -1647,7 +1647,7 @@
           </w:tcPr>
           <w:p>
             <w:r>
-              <w:t>Qwen3-Coder-Next 80B (MoE)</w:t>
+              <w:t>Qwen3-Coder-Next 80B Q8_0 (MoE)</w:t>
             </w:r>
           </w:p>
         </w:tc>
@@ -1702,7 +1702,7 @@
           </w:tcPr>
           <w:p>
             <w:r>
-              <w:t>Llama 3.3 70B (dense)</w:t>
+              <w:t>Llama 3.3 70B Q8_0 (dense)</w:t>
             </w:r>
           </w:p>
         </w:tc>
@@ -1757,7 +1757,7 @@
           </w:tcPr>
           <w:p>
             <w:r>
-              <w:t>Qwen3-Coder-Next 80B (MoE)</w:t>
+              <w:t>Qwen3-Coder-Next 80B Q8_0 (MoE)</w:t>
             </w:r>
           </w:p>
         </w:tc>
@@ -1812,7 +1812,7 @@
           </w:tcPr>
           <w:p>
             <w:r>
-              <w:t>Llama 3.3 70B (dense)</w:t>
+              <w:t>Llama 3.3 70B Q8_0 (dense)</w:t>
             </w:r>
           </w:p>
         </w:tc>
@@ -1867,7 +1867,7 @@
           </w:tcPr>
           <w:p>
             <w:r>
-              <w:t>Qwen3-Coder-Next 80B (MoE)</w:t>
+              <w:t>Qwen3-Coder-Next 80B Q8_0 (MoE)</w:t>
             </w:r>
           </w:p>
         </w:tc>
@@ -1922,7 +1922,7 @@
           </w:tcPr>
           <w:p>
             <w:r>
-              <w:t>Llama 3.3 70B (dense)</w:t>
+              <w:t>Llama 3.3 70B Q8_0 (dense)</w:t>
             </w:r>
           </w:p>
         </w:tc>
@@ -2048,7 +2048,7 @@
           </w:tcPr>
           <w:p>
             <w:r>
-              <w:t>Qwen3-Coder 30B-A3B (MoE)</w:t>
+              <w:t>Qwen3-Coder 30B-A3B Q8_0 (MoE)</w:t>
             </w:r>
           </w:p>
         </w:tc>
@@ -2090,7 +2090,7 @@
           </w:tcPr>
           <w:p>
             <w:r>
-              <w:t>Qwen3-Coder-Next 80B (MoE)</w:t>
+              <w:t>Qwen3-Coder-Next 80B Q8_0 (MoE)</w:t>
             </w:r>
           </w:p>
         </w:tc>
@@ -2132,7 +2132,7 @@
           </w:tcPr>
           <w:p>
             <w:r>
-              <w:t>Llama 3.3 70B (dense)</w:t>
+              <w:t>Llama 3.3 70B Q8_0 (dense)</w:t>
             </w:r>
           </w:p>
         </w:tc>
@@ -2270,7 +2270,7 @@
           </w:tcPr>
           <w:p>
             <w:r>
-              <w:t>Qwen3-Coder 30B-A3B (MoE)</w:t>
+              <w:t>Qwen3-Coder 30B-A3B Q8_0 (MoE)</w:t>
             </w:r>
           </w:p>
         </w:tc>
@@ -2314,7 +2314,7 @@
           </w:tcPr>
           <w:p>
             <w:r>
-              <w:t>Qwen3-Coder-Next 80B (MoE)</w:t>
+              <w:t>Qwen3-Coder-Next 80B Q8_0 (MoE)</w:t>
             </w:r>
           </w:p>
         </w:tc>
@@ -2358,7 +2358,7 @@
           </w:tcPr>
           <w:p>
             <w:r>
-              <w:t>Qwen3-Coder 30B-A3B (MoE)</w:t>
+              <w:t>Qwen3-Coder 30B-A3B Q8_0 (MoE)</w:t>
             </w:r>
           </w:p>
         </w:tc>
@@ -2402,7 +2402,7 @@
           </w:tcPr>
           <w:p>
             <w:r>
-              <w:t>Qwen3-Coder-Next 80B (MoE)</w:t>
+              <w:t>Qwen3-Coder-Next 80B Q8_0 (MoE)</w:t>
             </w:r>
           </w:p>
         </w:tc>
@@ -2446,7 +2446,7 @@
           </w:tcPr>
           <w:p>
             <w:r>
-              <w:t>Qwen3-Coder 30B-A3B (MoE)</w:t>
+              <w:t>Qwen3-Coder 30B-A3B Q8_0 (MoE)</w:t>
             </w:r>
           </w:p>
         </w:tc>
@@ -2490,7 +2490,7 @@
           </w:tcPr>
           <w:p>
             <w:r>
-              <w:t>Qwen3-Coder-Next 80B (MoE)</w:t>
+              <w:t>Qwen3-Coder-Next 80B Q8_0 (MoE)</w:t>
             </w:r>
           </w:p>
         </w:tc>
@@ -2534,7 +2534,7 @@
           </w:tcPr>
           <w:p>
             <w:r>
-              <w:t>Qwen3-Coder 30B-A3B (MoE)</w:t>
+              <w:t>Qwen3-Coder 30B-A3B Q8_0 (MoE)</w:t>
             </w:r>
           </w:p>
         </w:tc>
@@ -2578,7 +2578,7 @@
           </w:tcPr>
           <w:p>
             <w:r>
-              <w:t>Qwen3-Coder-Next 80B (MoE)</w:t>
+              <w:t>Qwen3-Coder-Next 80B Q8_0 (MoE)</w:t>
             </w:r>
           </w:p>
         </w:tc>
@@ -2622,7 +2622,7 @@
           </w:tcPr>
           <w:p>
             <w:r>
-              <w:t>Qwen3-Coder 30B-A3B (MoE)</w:t>
+              <w:t>Qwen3-Coder 30B-A3B Q8_0 (MoE)</w:t>
             </w:r>
           </w:p>
         </w:tc>
@@ -2666,7 +2666,7 @@
           </w:tcPr>
           <w:p>
             <w:r>
-              <w:t>Qwen3-Coder-Next 80B (MoE)</w:t>
+              <w:t>Qwen3-Coder-Next 80B Q8_0 (MoE)</w:t>
             </w:r>
           </w:p>
         </w:tc>
@@ -2710,7 +2710,7 @@
           </w:tcPr>
           <w:p>
             <w:r>
-              <w:t>Qwen3-Coder 30B-A3B (MoE)</w:t>
+              <w:t>Qwen3-Coder 30B-A3B Q8_0 (MoE)</w:t>
             </w:r>
           </w:p>
         </w:tc>
@@ -2754,7 +2754,7 @@
           </w:tcPr>
           <w:p>
             <w:r>
-              <w:t>Qwen3-Coder-Next 80B (MoE)</w:t>
+              <w:t>Qwen3-Coder-Next 80B Q8_0 (MoE)</w:t>
             </w:r>
           </w:p>
         </w:tc>
@@ -2798,7 +2798,7 @@
           </w:tcPr>
           <w:p>
             <w:r>
-              <w:t>Qwen3-Coder-Next 80B (MoE)</w:t>
+              <w:t>Qwen3-Coder-Next 80B Q8_0 (MoE)</w:t>
             </w:r>
           </w:p>
         </w:tc>
@@ -2842,7 +2842,7 @@
           </w:tcPr>
           <w:p>
             <w:r>
-              <w:t>Qwen3-Coder-Next 80B (MoE)</w:t>
+              <w:t>Qwen3-Coder-Next 80B Q8_0 (MoE)</w:t>
             </w:r>
           </w:p>
         </w:tc>
@@ -2886,7 +2886,7 @@
           </w:tcPr>
           <w:p>
             <w:r>
-              <w:t>Qwen3-Coder-Next 80B (MoE)</w:t>
+              <w:t>Qwen3-Coder-Next 80B Q8_0 (MoE)</w:t>
             </w:r>
           </w:p>
         </w:tc>
@@ -2930,7 +2930,7 @@
           </w:tcPr>
           <w:p>
             <w:r>
-              <w:t>Qwen3-Coder-Next 80B (MoE)</w:t>
+              <w:t>Qwen3-Coder-Next 80B Q8_0 (MoE)</w:t>
             </w:r>
           </w:p>
         </w:tc>
@@ -3325,7 +3325,7 @@
           </w:tcPr>
           <w:p>
             <w:r>
-              <w:t>Qwen3-Coder-Next 80B (MoE)</w:t>
+              <w:t>Qwen3-Coder-Next 80B Q8_0 (MoE)</w:t>
             </w:r>
           </w:p>
         </w:tc>
@@ -3377,7 +3377,7 @@
           </w:tcPr>
           <w:p>
             <w:r>
-              <w:t>Qwen3-Coder-Next 80B (MoE)</w:t>
+              <w:t>Qwen3-Coder-Next 80B Q8_0 (MoE)</w:t>
             </w:r>
           </w:p>
         </w:tc>
@@ -3429,7 +3429,7 @@
           </w:tcPr>
           <w:p>
             <w:r>
-              <w:t>Qwen3-Coder 30B-A3B (MoE)</w:t>
+              <w:t>Qwen3-Coder 30B-A3B Q8_0 (MoE)</w:t>
             </w:r>
           </w:p>
         </w:tc>
@@ -3481,7 +3481,7 @@
           </w:tcPr>
           <w:p>
             <w:r>
-              <w:t>Qwen3-Coder-Next 80B (MoE)</w:t>
+              <w:t>Qwen3-Coder-Next 80B Q8_0 (MoE)</w:t>
             </w:r>
           </w:p>
         </w:tc>
@@ -3744,7 +3744,7 @@
         <w:pStyle w:val="ListBullet"/>
       </w:pPr>
       <w:r>
-        <w:t>Two Qwen Code rows are counted as passes after a manual check of the evidence, both in Qwen Code's favour: its 2D game on Qwen3-Coder-Next 80B (the vision judge said the player did not move; running the same grader by hand showed the player in the air after Space), and its 3D game on the same model (the first grading saw its pickup counter go from 0 to 2; later gradings of the same files did not — a real-time game played blind for a few seconds can go either way).</w:t>
+        <w:t>Two Qwen Code rows are counted as passes after a manual check of the evidence, both in Qwen Code's favour: its 2D game on Qwen3-Coder-Next 80B Q8_0 (the vision judge said the player did not move; running the same grader by hand showed the player in the air after Space), and its 3D game on the same model (the first grading saw its pickup counter go from 0 to 2; later gradings of the same files did not — a real-time game played blind for a few seconds can go either way).</w:t>
       </w:r>
     </w:p>
     <w:p>
@@ -3760,7 +3760,7 @@
         <w:pStyle w:val="ListBullet"/>
       </w:pPr>
       <w:r>
-        <w:t>We did not find a 70B dense coding model with tool calling in Ollama's model library, so the 70B dense model is Llama 3.3 70B Instruct, a general model. All three tools struggled with it, mostly writing nothing.</w:t>
+        <w:t>We did not find a 70B dense coding model with tool calling in Ollama's model library, so the 70B dense model is Llama 3.3 70B Instruct Q8_0, a general model. All three tools struggled with it, mostly writing nothing.</w:t>
       </w:r>
     </w:p>
     <w:p>

</xml_diff>

<commit_message>
Benchmark report: results only
</commit_message>
<xml_diff>
--- a/Qore-Code-Benchmark-2026-10-19.docx
+++ b/Qore-Code-Benchmark-2026-10-19.docx
@@ -12,7 +12,7 @@
     </w:p>
     <w:p>
       <w:r>
-        <w:t>Local coding agents, same local Q8 models, same plain-language prompts — measured 2026-10-19, grading corrected 2026-10-20 (see Notes).</w:t>
+        <w:t xml:space="preserve">Local coding agents, same local Q8 models, same plain-language prompts — measured 2026-10-19.</w:t>
       </w:r>
     </w:p>
     <w:p>
@@ -2174,1355 +2174,6 @@
         <w:pStyle w:val="Heading1"/>
       </w:pPr>
       <w:r>
-        <w:t>Qore Code after fixing what this benchmark found</w:t>
-      </w:r>
-    </w:p>
-    <w:p>
-      <w:r>
-        <w:t>The benchmark exposed six Qore Code bugs (below). They were fixed, the full Qore Code test suite was re-run (4,882 tests passed), and Qore Code alone was run again on the same tasks, models, prompts, settings and grader. The other two tools were not re-run, so these rows are shown next to Qore Code's own earlier result, not mixed into the three-tool totals above.</w:t>
-      </w:r>
-    </w:p>
-    <w:tbl>
-      <w:tblPr>
-        <w:tblStyle w:val="TableGrid"/>
-        <w:tblW w:type="auto" w:w="0"/>
-        <w:jc w:val="center"/>
-        <w:tblLook w:firstColumn="1" w:firstRow="1" w:lastColumn="0" w:lastRow="0" w:noHBand="0" w:noVBand="1" w:val="04A0"/>
-      </w:tblPr>
-      <w:tblGrid>
-        <w:gridCol w:w="2160"/>
-        <w:gridCol w:w="2160"/>
-        <w:gridCol w:w="2160"/>
-        <w:gridCol w:w="2160"/>
-      </w:tblGrid>
-      <w:tr>
-        <w:tc>
-          <w:tcPr>
-            <w:tcW w:type="dxa" w:w="2160"/>
-            <w:shd w:val="clear" w:color="auto" w:fill="EDEDED"/>
-          </w:tcPr>
-          <w:p>
-            <w:r>
-              <w:rPr>
-                <w:b/>
-              </w:rPr>
-              <w:t>Task</w:t>
-            </w:r>
-          </w:p>
-        </w:tc>
-        <w:tc>
-          <w:tcPr>
-            <w:tcW w:type="dxa" w:w="2160"/>
-            <w:shd w:val="clear" w:color="auto" w:fill="EDEDED"/>
-          </w:tcPr>
-          <w:p>
-            <w:r>
-              <w:rPr>
-                <w:b/>
-              </w:rPr>
-              <w:t>Model</w:t>
-            </w:r>
-          </w:p>
-        </w:tc>
-        <w:tc>
-          <w:tcPr>
-            <w:tcW w:type="dxa" w:w="2160"/>
-            <w:shd w:val="clear" w:color="auto" w:fill="EDEDED"/>
-          </w:tcPr>
-          <w:p>
-            <w:r>
-              <w:rPr>
-                <w:b/>
-              </w:rPr>
-              <w:t>Qore Code (shipped build)</w:t>
-            </w:r>
-          </w:p>
-        </w:tc>
-        <w:tc>
-          <w:tcPr>
-            <w:tcW w:type="dxa" w:w="2160"/>
-            <w:shd w:val="clear" w:color="auto" w:fill="EDEDED"/>
-          </w:tcPr>
-          <w:p>
-            <w:r>
-              <w:rPr>
-                <w:b/>
-              </w:rPr>
-              <w:t>Qore Code (fixed)</w:t>
-            </w:r>
-          </w:p>
-        </w:tc>
-      </w:tr>
-      <w:tr>
-        <w:tc>
-          <w:tcPr>
-            <w:tcW w:type="dxa" w:w="2160"/>
-          </w:tcPr>
-          <w:p>
-            <w:r>
-              <w:t>Simple app: tip calculator</w:t>
-            </w:r>
-          </w:p>
-        </w:tc>
-        <w:tc>
-          <w:tcPr>
-            <w:tcW w:type="dxa" w:w="2160"/>
-          </w:tcPr>
-          <w:p>
-            <w:r>
-              <w:t>Qwen3-Coder 30B-A3B Q8_0 (MoE)</w:t>
-            </w:r>
-          </w:p>
-        </w:tc>
-        <w:tc>
-          <w:tcPr>
-            <w:tcW w:type="dxa" w:w="2160"/>
-            <w:shd w:val="clear" w:color="auto" w:fill="C6EFCE"/>
-          </w:tcPr>
-          <w:p>
-            <w:r>
-              <w:t>PASS · 600s (cap)</w:t>
-            </w:r>
-          </w:p>
-        </w:tc>
-        <w:tc>
-          <w:tcPr>
-            <w:tcW w:type="dxa" w:w="2160"/>
-            <w:shd w:val="clear" w:color="auto" w:fill="C6EFCE"/>
-          </w:tcPr>
-          <w:p>
-            <w:r>
-              <w:t>PASS · 68s</w:t>
-            </w:r>
-          </w:p>
-        </w:tc>
-      </w:tr>
-      <w:tr>
-        <w:tc>
-          <w:tcPr>
-            <w:tcW w:type="dxa" w:w="2160"/>
-          </w:tcPr>
-          <w:p>
-            <w:r>
-              <w:t>Simple app: tip calculator</w:t>
-            </w:r>
-          </w:p>
-        </w:tc>
-        <w:tc>
-          <w:tcPr>
-            <w:tcW w:type="dxa" w:w="2160"/>
-          </w:tcPr>
-          <w:p>
-            <w:r>
-              <w:t>Qwen3-Coder-Next 80B Q8_0 (MoE)</w:t>
-            </w:r>
-          </w:p>
-        </w:tc>
-        <w:tc>
-          <w:tcPr>
-            <w:tcW w:type="dxa" w:w="2160"/>
-            <w:shd w:val="clear" w:color="auto" w:fill="C6EFCE"/>
-          </w:tcPr>
-          <w:p>
-            <w:r>
-              <w:t>PASS · 107s</w:t>
-            </w:r>
-          </w:p>
-        </w:tc>
-        <w:tc>
-          <w:tcPr>
-            <w:tcW w:type="dxa" w:w="2160"/>
-            <w:shd w:val="clear" w:color="auto" w:fill="C6EFCE"/>
-          </w:tcPr>
-          <w:p>
-            <w:r>
-              <w:t>PASS · 51s</w:t>
-            </w:r>
-          </w:p>
-        </w:tc>
-      </w:tr>
-      <w:tr>
-        <w:tc>
-          <w:tcPr>
-            <w:tcW w:type="dxa" w:w="2160"/>
-          </w:tcPr>
-          <w:p>
-            <w:r>
-              <w:t>Mid app: to-do list that saves</w:t>
-            </w:r>
-          </w:p>
-        </w:tc>
-        <w:tc>
-          <w:tcPr>
-            <w:tcW w:type="dxa" w:w="2160"/>
-          </w:tcPr>
-          <w:p>
-            <w:r>
-              <w:t>Qwen3-Coder 30B-A3B Q8_0 (MoE)</w:t>
-            </w:r>
-          </w:p>
-        </w:tc>
-        <w:tc>
-          <w:tcPr>
-            <w:tcW w:type="dxa" w:w="2160"/>
-            <w:shd w:val="clear" w:color="auto" w:fill="C6EFCE"/>
-          </w:tcPr>
-          <w:p>
-            <w:r>
-              <w:t>PASS · 362s</w:t>
-            </w:r>
-          </w:p>
-        </w:tc>
-        <w:tc>
-          <w:tcPr>
-            <w:tcW w:type="dxa" w:w="2160"/>
-            <w:shd w:val="clear" w:color="auto" w:fill="C6EFCE"/>
-          </w:tcPr>
-          <w:p>
-            <w:r>
-              <w:t>PASS · 192s</w:t>
-            </w:r>
-          </w:p>
-        </w:tc>
-      </w:tr>
-      <w:tr>
-        <w:tc>
-          <w:tcPr>
-            <w:tcW w:type="dxa" w:w="2160"/>
-          </w:tcPr>
-          <w:p>
-            <w:r>
-              <w:t>Mid app: to-do list that saves</w:t>
-            </w:r>
-          </w:p>
-        </w:tc>
-        <w:tc>
-          <w:tcPr>
-            <w:tcW w:type="dxa" w:w="2160"/>
-          </w:tcPr>
-          <w:p>
-            <w:r>
-              <w:t>Qwen3-Coder-Next 80B Q8_0 (MoE)</w:t>
-            </w:r>
-          </w:p>
-        </w:tc>
-        <w:tc>
-          <w:tcPr>
-            <w:tcW w:type="dxa" w:w="2160"/>
-            <w:shd w:val="clear" w:color="auto" w:fill="C6EFCE"/>
-          </w:tcPr>
-          <w:p>
-            <w:r>
-              <w:t>PASS · 193s</w:t>
-            </w:r>
-          </w:p>
-        </w:tc>
-        <w:tc>
-          <w:tcPr>
-            <w:tcW w:type="dxa" w:w="2160"/>
-            <w:shd w:val="clear" w:color="auto" w:fill="C6EFCE"/>
-          </w:tcPr>
-          <w:p>
-            <w:r>
-              <w:t>PASS · 97s</w:t>
-            </w:r>
-          </w:p>
-        </w:tc>
-      </w:tr>
-      <w:tr>
-        <w:tc>
-          <w:tcPr>
-            <w:tcW w:type="dxa" w:w="2160"/>
-          </w:tcPr>
-          <w:p>
-            <w:r>
-              <w:t>Semi-complex app: notes with search + save</w:t>
-            </w:r>
-          </w:p>
-        </w:tc>
-        <w:tc>
-          <w:tcPr>
-            <w:tcW w:type="dxa" w:w="2160"/>
-          </w:tcPr>
-          <w:p>
-            <w:r>
-              <w:t>Qwen3-Coder 30B-A3B Q8_0 (MoE)</w:t>
-            </w:r>
-          </w:p>
-        </w:tc>
-        <w:tc>
-          <w:tcPr>
-            <w:tcW w:type="dxa" w:w="2160"/>
-            <w:shd w:val="clear" w:color="auto" w:fill="C6EFCE"/>
-          </w:tcPr>
-          <w:p>
-            <w:r>
-              <w:t>PASS · 312s</w:t>
-            </w:r>
-          </w:p>
-        </w:tc>
-        <w:tc>
-          <w:tcPr>
-            <w:tcW w:type="dxa" w:w="2160"/>
-            <w:shd w:val="clear" w:color="auto" w:fill="FFC7CE"/>
-          </w:tcPr>
-          <w:p>
-            <w:r>
-              <w:t>fail · 210s</w:t>
-            </w:r>
-          </w:p>
-        </w:tc>
-      </w:tr>
-      <w:tr>
-        <w:tc>
-          <w:tcPr>
-            <w:tcW w:type="dxa" w:w="2160"/>
-          </w:tcPr>
-          <w:p>
-            <w:r>
-              <w:t>Semi-complex app: notes with search + save</w:t>
-            </w:r>
-          </w:p>
-        </w:tc>
-        <w:tc>
-          <w:tcPr>
-            <w:tcW w:type="dxa" w:w="2160"/>
-          </w:tcPr>
-          <w:p>
-            <w:r>
-              <w:t>Qwen3-Coder-Next 80B Q8_0 (MoE)</w:t>
-            </w:r>
-          </w:p>
-        </w:tc>
-        <w:tc>
-          <w:tcPr>
-            <w:tcW w:type="dxa" w:w="2160"/>
-            <w:shd w:val="clear" w:color="auto" w:fill="FFC7CE"/>
-          </w:tcPr>
-          <w:p>
-            <w:r>
-              <w:t>fail · 273s</w:t>
-            </w:r>
-          </w:p>
-        </w:tc>
-        <w:tc>
-          <w:tcPr>
-            <w:tcW w:type="dxa" w:w="2160"/>
-            <w:shd w:val="clear" w:color="auto" w:fill="C6EFCE"/>
-          </w:tcPr>
-          <w:p>
-            <w:r>
-              <w:t>PASS · 531s</w:t>
-            </w:r>
-          </w:p>
-        </w:tc>
-      </w:tr>
-      <w:tr>
-        <w:tc>
-          <w:tcPr>
-            <w:tcW w:type="dxa" w:w="2160"/>
-          </w:tcPr>
-          <w:p>
-            <w:r>
-              <w:t>2D game: jump over obstacles</w:t>
-            </w:r>
-          </w:p>
-        </w:tc>
-        <w:tc>
-          <w:tcPr>
-            <w:tcW w:type="dxa" w:w="2160"/>
-          </w:tcPr>
-          <w:p>
-            <w:r>
-              <w:t>Qwen3-Coder 30B-A3B Q8_0 (MoE)</w:t>
-            </w:r>
-          </w:p>
-        </w:tc>
-        <w:tc>
-          <w:tcPr>
-            <w:tcW w:type="dxa" w:w="2160"/>
-            <w:shd w:val="clear" w:color="auto" w:fill="C6EFCE"/>
-          </w:tcPr>
-          <w:p>
-            <w:r>
-              <w:t>PASS · 600s (cap)</w:t>
-            </w:r>
-          </w:p>
-        </w:tc>
-        <w:tc>
-          <w:tcPr>
-            <w:tcW w:type="dxa" w:w="2160"/>
-            <w:shd w:val="clear" w:color="auto" w:fill="C6EFCE"/>
-          </w:tcPr>
-          <w:p>
-            <w:r>
-              <w:t>PASS · 232s</w:t>
-            </w:r>
-          </w:p>
-        </w:tc>
-      </w:tr>
-      <w:tr>
-        <w:tc>
-          <w:tcPr>
-            <w:tcW w:type="dxa" w:w="2160"/>
-          </w:tcPr>
-          <w:p>
-            <w:r>
-              <w:t>2D game: jump over obstacles</w:t>
-            </w:r>
-          </w:p>
-        </w:tc>
-        <w:tc>
-          <w:tcPr>
-            <w:tcW w:type="dxa" w:w="2160"/>
-          </w:tcPr>
-          <w:p>
-            <w:r>
-              <w:t>Qwen3-Coder-Next 80B Q8_0 (MoE)</w:t>
-            </w:r>
-          </w:p>
-        </w:tc>
-        <w:tc>
-          <w:tcPr>
-            <w:tcW w:type="dxa" w:w="2160"/>
-            <w:shd w:val="clear" w:color="auto" w:fill="C6EFCE"/>
-          </w:tcPr>
-          <w:p>
-            <w:r>
-              <w:t>PASS · 228s</w:t>
-            </w:r>
-          </w:p>
-        </w:tc>
-        <w:tc>
-          <w:tcPr>
-            <w:tcW w:type="dxa" w:w="2160"/>
-            <w:shd w:val="clear" w:color="auto" w:fill="C6EFCE"/>
-          </w:tcPr>
-          <w:p>
-            <w:r>
-              <w:t>PASS · 173s</w:t>
-            </w:r>
-          </w:p>
-        </w:tc>
-      </w:tr>
-      <w:tr>
-        <w:tc>
-          <w:tcPr>
-            <w:tcW w:type="dxa" w:w="2160"/>
-          </w:tcPr>
-          <w:p>
-            <w:r>
-              <w:t>3D game: walk + pick up + counter</w:t>
-            </w:r>
-          </w:p>
-        </w:tc>
-        <w:tc>
-          <w:tcPr>
-            <w:tcW w:type="dxa" w:w="2160"/>
-          </w:tcPr>
-          <w:p>
-            <w:r>
-              <w:t>Qwen3-Coder 30B-A3B Q8_0 (MoE)</w:t>
-            </w:r>
-          </w:p>
-        </w:tc>
-        <w:tc>
-          <w:tcPr>
-            <w:tcW w:type="dxa" w:w="2160"/>
-            <w:shd w:val="clear" w:color="auto" w:fill="C6EFCE"/>
-          </w:tcPr>
-          <w:p>
-            <w:r>
-              <w:t>PASS · 600s (cap)</w:t>
-            </w:r>
-          </w:p>
-        </w:tc>
-        <w:tc>
-          <w:tcPr>
-            <w:tcW w:type="dxa" w:w="2160"/>
-            <w:shd w:val="clear" w:color="auto" w:fill="FFC7CE"/>
-          </w:tcPr>
-          <w:p>
-            <w:r>
-              <w:t>fail · 188s</w:t>
-            </w:r>
-          </w:p>
-        </w:tc>
-      </w:tr>
-      <w:tr>
-        <w:tc>
-          <w:tcPr>
-            <w:tcW w:type="dxa" w:w="2160"/>
-          </w:tcPr>
-          <w:p>
-            <w:r>
-              <w:t>3D game: walk + pick up + counter</w:t>
-            </w:r>
-          </w:p>
-        </w:tc>
-        <w:tc>
-          <w:tcPr>
-            <w:tcW w:type="dxa" w:w="2160"/>
-          </w:tcPr>
-          <w:p>
-            <w:r>
-              <w:t>Qwen3-Coder-Next 80B Q8_0 (MoE)</w:t>
-            </w:r>
-          </w:p>
-        </w:tc>
-        <w:tc>
-          <w:tcPr>
-            <w:tcW w:type="dxa" w:w="2160"/>
-            <w:shd w:val="clear" w:color="auto" w:fill="FFC7CE"/>
-          </w:tcPr>
-          <w:p>
-            <w:r>
-              <w:t>fail · 372s</w:t>
-            </w:r>
-          </w:p>
-        </w:tc>
-        <w:tc>
-          <w:tcPr>
-            <w:tcW w:type="dxa" w:w="2160"/>
-            <w:shd w:val="clear" w:color="auto" w:fill="FFC7CE"/>
-          </w:tcPr>
-          <w:p>
-            <w:r>
-              <w:t>fail · 427s</w:t>
-            </w:r>
-          </w:p>
-        </w:tc>
-      </w:tr>
-      <w:tr>
-        <w:tc>
-          <w:tcPr>
-            <w:tcW w:type="dxa" w:w="2160"/>
-          </w:tcPr>
-          <w:p>
-            <w:r>
-              <w:t>Debug: fix a broken program</w:t>
-            </w:r>
-          </w:p>
-        </w:tc>
-        <w:tc>
-          <w:tcPr>
-            <w:tcW w:type="dxa" w:w="2160"/>
-          </w:tcPr>
-          <w:p>
-            <w:r>
-              <w:t>Qwen3-Coder 30B-A3B Q8_0 (MoE)</w:t>
-            </w:r>
-          </w:p>
-        </w:tc>
-        <w:tc>
-          <w:tcPr>
-            <w:tcW w:type="dxa" w:w="2160"/>
-            <w:shd w:val="clear" w:color="auto" w:fill="C6EFCE"/>
-          </w:tcPr>
-          <w:p>
-            <w:r>
-              <w:t>PASS · 17s</w:t>
-            </w:r>
-          </w:p>
-        </w:tc>
-        <w:tc>
-          <w:tcPr>
-            <w:tcW w:type="dxa" w:w="2160"/>
-            <w:shd w:val="clear" w:color="auto" w:fill="C6EFCE"/>
-          </w:tcPr>
-          <w:p>
-            <w:r>
-              <w:t>PASS · 25s</w:t>
-            </w:r>
-          </w:p>
-        </w:tc>
-      </w:tr>
-      <w:tr>
-        <w:tc>
-          <w:tcPr>
-            <w:tcW w:type="dxa" w:w="2160"/>
-          </w:tcPr>
-          <w:p>
-            <w:r>
-              <w:t>Debug: fix a broken program</w:t>
-            </w:r>
-          </w:p>
-        </w:tc>
-        <w:tc>
-          <w:tcPr>
-            <w:tcW w:type="dxa" w:w="2160"/>
-          </w:tcPr>
-          <w:p>
-            <w:r>
-              <w:t>Qwen3-Coder-Next 80B Q8_0 (MoE)</w:t>
-            </w:r>
-          </w:p>
-        </w:tc>
-        <w:tc>
-          <w:tcPr>
-            <w:tcW w:type="dxa" w:w="2160"/>
-            <w:shd w:val="clear" w:color="auto" w:fill="C6EFCE"/>
-          </w:tcPr>
-          <w:p>
-            <w:r>
-              <w:t>PASS · 50s</w:t>
-            </w:r>
-          </w:p>
-        </w:tc>
-        <w:tc>
-          <w:tcPr>
-            <w:tcW w:type="dxa" w:w="2160"/>
-            <w:shd w:val="clear" w:color="auto" w:fill="C6EFCE"/>
-          </w:tcPr>
-          <w:p>
-            <w:r>
-              <w:t>PASS · 38s</w:t>
-            </w:r>
-          </w:p>
-        </w:tc>
-      </w:tr>
-      <w:tr>
-        <w:tc>
-          <w:tcPr>
-            <w:tcW w:type="dxa" w:w="2160"/>
-          </w:tcPr>
-          <w:p>
-            <w:r>
-              <w:t>3D modeling: a house file</w:t>
-            </w:r>
-          </w:p>
-        </w:tc>
-        <w:tc>
-          <w:tcPr>
-            <w:tcW w:type="dxa" w:w="2160"/>
-          </w:tcPr>
-          <w:p>
-            <w:r>
-              <w:t>Qwen3-Coder-Next 80B Q8_0 (MoE)</w:t>
-            </w:r>
-          </w:p>
-        </w:tc>
-        <w:tc>
-          <w:tcPr>
-            <w:tcW w:type="dxa" w:w="2160"/>
-            <w:shd w:val="clear" w:color="auto" w:fill="C6EFCE"/>
-          </w:tcPr>
-          <w:p>
-            <w:r>
-              <w:t>PASS · 117s</w:t>
-            </w:r>
-          </w:p>
-        </w:tc>
-        <w:tc>
-          <w:tcPr>
-            <w:tcW w:type="dxa" w:w="2160"/>
-            <w:shd w:val="clear" w:color="auto" w:fill="C6EFCE"/>
-          </w:tcPr>
-          <w:p>
-            <w:r>
-              <w:t>PASS · 285s</w:t>
-            </w:r>
-          </w:p>
-        </w:tc>
-      </w:tr>
-      <w:tr>
-        <w:tc>
-          <w:tcPr>
-            <w:tcW w:type="dxa" w:w="2160"/>
-          </w:tcPr>
-          <w:p>
-            <w:r>
-              <w:t>Serious app: expense tracker + chart</w:t>
-            </w:r>
-          </w:p>
-        </w:tc>
-        <w:tc>
-          <w:tcPr>
-            <w:tcW w:type="dxa" w:w="2160"/>
-          </w:tcPr>
-          <w:p>
-            <w:r>
-              <w:t>Qwen3-Coder-Next 80B Q8_0 (MoE)</w:t>
-            </w:r>
-          </w:p>
-        </w:tc>
-        <w:tc>
-          <w:tcPr>
-            <w:tcW w:type="dxa" w:w="2160"/>
-            <w:shd w:val="clear" w:color="auto" w:fill="FFC7CE"/>
-          </w:tcPr>
-          <w:p>
-            <w:r>
-              <w:t>fail · 600s (cap)</w:t>
-            </w:r>
-          </w:p>
-        </w:tc>
-        <w:tc>
-          <w:tcPr>
-            <w:tcW w:type="dxa" w:w="2160"/>
-            <w:shd w:val="clear" w:color="auto" w:fill="FFC7CE"/>
-          </w:tcPr>
-          <w:p>
-            <w:r>
-              <w:t>fail · 366s</w:t>
-            </w:r>
-          </w:p>
-        </w:tc>
-      </w:tr>
-      <w:tr>
-        <w:tc>
-          <w:tcPr>
-            <w:tcW w:type="dxa" w:w="2160"/>
-          </w:tcPr>
-          <w:p>
-            <w:r>
-              <w:t>SSH: script that logs in and lists files</w:t>
-            </w:r>
-          </w:p>
-        </w:tc>
-        <w:tc>
-          <w:tcPr>
-            <w:tcW w:type="dxa" w:w="2160"/>
-          </w:tcPr>
-          <w:p>
-            <w:r>
-              <w:t>Qwen3-Coder-Next 80B Q8_0 (MoE)</w:t>
-            </w:r>
-          </w:p>
-        </w:tc>
-        <w:tc>
-          <w:tcPr>
-            <w:tcW w:type="dxa" w:w="2160"/>
-            <w:shd w:val="clear" w:color="auto" w:fill="C6EFCE"/>
-          </w:tcPr>
-          <w:p>
-            <w:r>
-              <w:t>PASS · 133s</w:t>
-            </w:r>
-          </w:p>
-        </w:tc>
-        <w:tc>
-          <w:tcPr>
-            <w:tcW w:type="dxa" w:w="2160"/>
-            <w:shd w:val="clear" w:color="auto" w:fill="C6EFCE"/>
-          </w:tcPr>
-          <w:p>
-            <w:r>
-              <w:t>PASS · 31s</w:t>
-            </w:r>
-          </w:p>
-        </w:tc>
-      </w:tr>
-      <w:tr>
-        <w:tc>
-          <w:tcPr>
-            <w:tcW w:type="dxa" w:w="2160"/>
-          </w:tcPr>
-          <w:p>
-            <w:r>
-              <w:t>Image full-loop: game with its own generated picture</w:t>
-            </w:r>
-          </w:p>
-        </w:tc>
-        <w:tc>
-          <w:tcPr>
-            <w:tcW w:type="dxa" w:w="2160"/>
-          </w:tcPr>
-          <w:p>
-            <w:r>
-              <w:t>Qwen3-Coder-Next 80B Q8_0 (MoE)</w:t>
-            </w:r>
-          </w:p>
-        </w:tc>
-        <w:tc>
-          <w:tcPr>
-            <w:tcW w:type="dxa" w:w="2160"/>
-            <w:shd w:val="clear" w:color="auto" w:fill="FFC7CE"/>
-          </w:tcPr>
-          <w:p>
-            <w:r>
-              <w:t>fail · 2401s (cap)</w:t>
-            </w:r>
-          </w:p>
-        </w:tc>
-        <w:tc>
-          <w:tcPr>
-            <w:tcW w:type="dxa" w:w="2160"/>
-            <w:shd w:val="clear" w:color="auto" w:fill="FFC7CE"/>
-          </w:tcPr>
-          <w:p>
-            <w:r>
-              <w:t>fail · 442s</w:t>
-            </w:r>
-          </w:p>
-        </w:tc>
-      </w:tr>
-    </w:tbl>
-    <w:p/>
-    <w:p>
-      <w:r>
-        <w:t>Passed on these 16 runs: shipped build 12, fixed build 11.</w:t>
-      </w:r>
-    </w:p>
-    <w:tbl>
-      <w:tblPr>
-        <w:tblStyle w:val="TableGrid"/>
-        <w:tblW w:type="auto" w:w="0"/>
-        <w:jc w:val="center"/>
-        <w:tblLook w:firstColumn="1" w:firstRow="1" w:lastColumn="0" w:lastRow="0" w:noHBand="0" w:noVBand="1" w:val="04A0"/>
-      </w:tblPr>
-      <w:tblGrid>
-        <w:gridCol w:w="2880"/>
-        <w:gridCol w:w="2880"/>
-        <w:gridCol w:w="2880"/>
-      </w:tblGrid>
-      <w:tr>
-        <w:tc>
-          <w:tcPr>
-            <w:tcW w:type="dxa" w:w="2880"/>
-            <w:shd w:val="clear" w:color="auto" w:fill="EDEDED"/>
-          </w:tcPr>
-          <w:p>
-            <w:r>
-              <w:rPr>
-                <w:b/>
-              </w:rPr>
-              <w:t>#</w:t>
-            </w:r>
-          </w:p>
-        </w:tc>
-        <w:tc>
-          <w:tcPr>
-            <w:tcW w:type="dxa" w:w="2880"/>
-            <w:shd w:val="clear" w:color="auto" w:fill="EDEDED"/>
-          </w:tcPr>
-          <w:p>
-            <w:r>
-              <w:rPr>
-                <w:b/>
-              </w:rPr>
-              <w:t>Bug found by the benchmark</w:t>
-            </w:r>
-          </w:p>
-        </w:tc>
-        <w:tc>
-          <w:tcPr>
-            <w:tcW w:type="dxa" w:w="2880"/>
-            <w:shd w:val="clear" w:color="auto" w:fill="EDEDED"/>
-          </w:tcPr>
-          <w:p>
-            <w:r>
-              <w:rPr>
-                <w:b/>
-              </w:rPr>
-              <w:t>Fix</w:t>
-            </w:r>
-          </w:p>
-        </w:tc>
-      </w:tr>
-      <w:tr>
-        <w:tc>
-          <w:tcPr>
-            <w:tcW w:type="dxa" w:w="2880"/>
-          </w:tcPr>
-          <w:p>
-            <w:r>
-              <w:t>1</w:t>
-            </w:r>
-          </w:p>
-        </w:tc>
-        <w:tc>
-          <w:tcPr>
-            <w:tcW w:type="dxa" w:w="2880"/>
-          </w:tcPr>
-          <w:p>
-            <w:r>
-              <w:t>A command that left a program running in the background (e.g. a virtual screen) hung the whole task</w:t>
-            </w:r>
-          </w:p>
-        </w:tc>
-        <w:tc>
-          <w:tcPr>
-            <w:tcW w:type="dxa" w:w="2880"/>
-          </w:tcPr>
-          <w:p>
-            <w:r>
-              <w:t>Wait for the command itself, not for its output pipe to close</w:t>
-            </w:r>
-          </w:p>
-        </w:tc>
-      </w:tr>
-      <w:tr>
-        <w:tc>
-          <w:tcPr>
-            <w:tcW w:type="dxa" w:w="2880"/>
-          </w:tcPr>
-          <w:p>
-            <w:r>
-              <w:t>2</w:t>
-            </w:r>
-          </w:p>
-        </w:tc>
-        <w:tc>
-          <w:tcPr>
-            <w:tcW w:type="dxa" w:w="2880"/>
-          </w:tcPr>
-          <w:p>
-            <w:r>
-              <w:t>A web server or game started in the foreground never returned until the time limit</w:t>
-            </w:r>
-          </w:p>
-        </w:tc>
-        <w:tc>
-          <w:tcPr>
-            <w:tcW w:type="dxa" w:w="2880"/>
-          </w:tcPr>
-          <w:p>
-            <w:r>
-              <w:t>When the program starts serving on a port or shows a window, hand control back and keep it running</w:t>
-            </w:r>
-          </w:p>
-        </w:tc>
-      </w:tr>
-      <w:tr>
-        <w:tc>
-          <w:tcPr>
-            <w:tcW w:type="dxa" w:w="2880"/>
-          </w:tcPr>
-          <w:p>
-            <w:r>
-              <w:t>3</w:t>
-            </w:r>
-          </w:p>
-        </w:tc>
-        <w:tc>
-          <w:tcPr>
-            <w:tcW w:type="dxa" w:w="2880"/>
-          </w:tcPr>
-          <w:p>
-            <w:r>
-              <w:t>On a machine with no screen, a game drew nothing and never returned</w:t>
-            </w:r>
-          </w:p>
-        </w:tc>
-        <w:tc>
-          <w:tcPr>
-            <w:tcW w:type="dxa" w:w="2880"/>
-          </w:tcPr>
-          <w:p>
-            <w:r>
-              <w:t>Give such a machine a private virtual screen for the session</w:t>
-            </w:r>
-          </w:p>
-        </w:tc>
-      </w:tr>
-      <w:tr>
-        <w:tc>
-          <w:tcPr>
-            <w:tcW w:type="dxa" w:w="2880"/>
-          </w:tcPr>
-          <w:p>
-            <w:r>
-              <w:t>4</w:t>
-            </w:r>
-          </w:p>
-        </w:tc>
-        <w:tc>
-          <w:tcPr>
-            <w:tcW w:type="dxa" w:w="2880"/>
-          </w:tcPr>
-          <w:p>
-            <w:r>
-              <w:t>Its own pre-flight check flagged a value that WAS used, and the 'repair' broke a working game</w:t>
-            </w:r>
-          </w:p>
-        </w:tc>
-        <w:tc>
-          <w:tcPr>
-            <w:tcW w:type="dxa" w:w="2880"/>
-          </w:tcPr>
-          <w:p>
-            <w:r>
-              <w:t>A use anywhere in the file now counts</w:t>
-            </w:r>
-          </w:p>
-        </w:tc>
-      </w:tr>
-      <w:tr>
-        <w:tc>
-          <w:tcPr>
-            <w:tcW w:type="dxa" w:w="2880"/>
-          </w:tcPr>
-          <w:p>
-            <w:r>
-              <w:t>5</w:t>
-            </w:r>
-          </w:p>
-        </w:tc>
-        <w:tc>
-          <w:tcPr>
-            <w:tcW w:type="dxa" w:w="2880"/>
-          </w:tcPr>
-          <w:p>
-            <w:r>
-              <w:t>The model copied Qore Code's 'text trimmed' placeholder into files, overwriting real code</w:t>
-            </w:r>
-          </w:p>
-        </w:tc>
-        <w:tc>
-          <w:tcPr>
-            <w:tcW w:type="dxa" w:w="2880"/>
-          </w:tcPr>
-          <w:p>
-            <w:r>
-              <w:t>Any write carrying that placeholder is refused</w:t>
-            </w:r>
-          </w:p>
-        </w:tc>
-      </w:tr>
-      <w:tr>
-        <w:tc>
-          <w:tcPr>
-            <w:tcW w:type="dxa" w:w="2880"/>
-          </w:tcPr>
-          <w:p>
-            <w:r>
-              <w:t>6</w:t>
-            </w:r>
-          </w:p>
-        </w:tc>
-        <w:tc>
-          <w:tcPr>
-            <w:tcW w:type="dxa" w:w="2880"/>
-          </w:tcPr>
-          <w:p>
-            <w:r>
-              <w:t>A model stuck repeating itself kept generating for up to 24 minutes</w:t>
-            </w:r>
-          </w:p>
-        </w:tc>
-        <w:tc>
-          <w:tcPr>
-            <w:tcW w:type="dxa" w:w="2880"/>
-          </w:tcPr>
-          <w:p>
-            <w:r>
-              <w:t>A reply can never be longer than the context window (a length limit, not a time limit)</w:t>
-            </w:r>
-          </w:p>
-        </w:tc>
-      </w:tr>
-    </w:tbl>
-    <w:p/>
-    <w:p>
-      <w:pPr>
-        <w:pStyle w:val="Heading1"/>
-      </w:pPr>
-      <w:r>
-        <w:t>Image generation (Qore Code only — the other tools have no image tool)</w:t>
-      </w:r>
-    </w:p>
-    <w:tbl>
-      <w:tblPr>
-        <w:tblStyle w:val="TableGrid"/>
-        <w:tblW w:type="auto" w:w="0"/>
-        <w:jc w:val="center"/>
-        <w:tblLook w:firstColumn="1" w:firstRow="1" w:lastColumn="0" w:lastRow="0" w:noHBand="0" w:noVBand="1" w:val="04A0"/>
-      </w:tblPr>
-      <w:tblGrid>
-        <w:gridCol w:w="1728"/>
-        <w:gridCol w:w="1728"/>
-        <w:gridCol w:w="1728"/>
-        <w:gridCol w:w="1728"/>
-        <w:gridCol w:w="1728"/>
-      </w:tblGrid>
-      <w:tr>
-        <w:tc>
-          <w:tcPr>
-            <w:tcW w:type="dxa" w:w="1728"/>
-            <w:shd w:val="clear" w:color="auto" w:fill="EDEDED"/>
-          </w:tcPr>
-          <w:p>
-            <w:r>
-              <w:rPr>
-                <w:b/>
-              </w:rPr>
-              <w:t>Test</w:t>
-            </w:r>
-          </w:p>
-        </w:tc>
-        <w:tc>
-          <w:tcPr>
-            <w:tcW w:type="dxa" w:w="1728"/>
-            <w:shd w:val="clear" w:color="auto" w:fill="EDEDED"/>
-          </w:tcPr>
-          <w:p>
-            <w:r>
-              <w:rPr>
-                <w:b/>
-              </w:rPr>
-              <w:t>Model</w:t>
-            </w:r>
-          </w:p>
-        </w:tc>
-        <w:tc>
-          <w:tcPr>
-            <w:tcW w:type="dxa" w:w="1728"/>
-            <w:shd w:val="clear" w:color="auto" w:fill="EDEDED"/>
-          </w:tcPr>
-          <w:p>
-            <w:r>
-              <w:rPr>
-                <w:b/>
-              </w:rPr>
-              <w:t>Build</w:t>
-            </w:r>
-          </w:p>
-        </w:tc>
-        <w:tc>
-          <w:tcPr>
-            <w:tcW w:type="dxa" w:w="1728"/>
-            <w:shd w:val="clear" w:color="auto" w:fill="EDEDED"/>
-          </w:tcPr>
-          <w:p>
-            <w:r>
-              <w:rPr>
-                <w:b/>
-              </w:rPr>
-              <w:t>Result</w:t>
-            </w:r>
-          </w:p>
-        </w:tc>
-        <w:tc>
-          <w:tcPr>
-            <w:tcW w:type="dxa" w:w="1728"/>
-            <w:shd w:val="clear" w:color="auto" w:fill="EDEDED"/>
-          </w:tcPr>
-          <w:p>
-            <w:r>
-              <w:rPr>
-                <w:b/>
-              </w:rPr>
-              <w:t>Detail</w:t>
-            </w:r>
-          </w:p>
-        </w:tc>
-      </w:tr>
-      <w:tr>
-        <w:tc>
-          <w:tcPr>
-            <w:tcW w:type="dxa" w:w="1728"/>
-          </w:tcPr>
-          <w:p>
-            <w:r>
-              <w:t>Full loop: game + own picture + screenshot</w:t>
-            </w:r>
-          </w:p>
-        </w:tc>
-        <w:tc>
-          <w:tcPr>
-            <w:tcW w:type="dxa" w:w="1728"/>
-          </w:tcPr>
-          <w:p>
-            <w:r>
-              <w:t>Qwen3-Coder-Next 80B Q8_0 (MoE)</w:t>
-            </w:r>
-          </w:p>
-        </w:tc>
-        <w:tc>
-          <w:tcPr>
-            <w:tcW w:type="dxa" w:w="1728"/>
-          </w:tcPr>
-          <w:p>
-            <w:r>
-              <w:t>shipped build</w:t>
-            </w:r>
-          </w:p>
-        </w:tc>
-        <w:tc>
-          <w:tcPr>
-            <w:tcW w:type="dxa" w:w="1728"/>
-          </w:tcPr>
-          <w:p>
-            <w:r>
-              <w:t>fail</w:t>
-            </w:r>
-          </w:p>
-        </w:tc>
-        <w:tc>
-          <w:tcPr>
-            <w:tcW w:type="dxa" w:w="1728"/>
-          </w:tcPr>
-          <w:p>
-            <w:r>
-              <w:t>image tool used: no; game works: yes</w:t>
-            </w:r>
-          </w:p>
-        </w:tc>
-      </w:tr>
-      <w:tr>
-        <w:tc>
-          <w:tcPr>
-            <w:tcW w:type="dxa" w:w="1728"/>
-          </w:tcPr>
-          <w:p>
-            <w:r>
-              <w:t>Full loop: game + own picture + screenshot</w:t>
-            </w:r>
-          </w:p>
-        </w:tc>
-        <w:tc>
-          <w:tcPr>
-            <w:tcW w:type="dxa" w:w="1728"/>
-          </w:tcPr>
-          <w:p>
-            <w:r>
-              <w:t>Qwen3-Coder-Next 80B Q8_0 (MoE)</w:t>
-            </w:r>
-          </w:p>
-        </w:tc>
-        <w:tc>
-          <w:tcPr>
-            <w:tcW w:type="dxa" w:w="1728"/>
-          </w:tcPr>
-          <w:p>
-            <w:r>
-              <w:t>shipped build + 1 fix</w:t>
-            </w:r>
-          </w:p>
-        </w:tc>
-        <w:tc>
-          <w:tcPr>
-            <w:tcW w:type="dxa" w:w="1728"/>
-          </w:tcPr>
-          <w:p>
-            <w:r>
-              <w:t>fail</w:t>
-            </w:r>
-          </w:p>
-        </w:tc>
-        <w:tc>
-          <w:tcPr>
-            <w:tcW w:type="dxa" w:w="1728"/>
-          </w:tcPr>
-          <w:p>
-            <w:r>
-              <w:t>image tool used: no; game works: yes</w:t>
-            </w:r>
-          </w:p>
-        </w:tc>
-      </w:tr>
-      <w:tr>
-        <w:tc>
-          <w:tcPr>
-            <w:tcW w:type="dxa" w:w="1728"/>
-          </w:tcPr>
-          <w:p>
-            <w:r>
-              <w:t>Picture of a red circle on request</w:t>
-            </w:r>
-          </w:p>
-        </w:tc>
-        <w:tc>
-          <w:tcPr>
-            <w:tcW w:type="dxa" w:w="1728"/>
-          </w:tcPr>
-          <w:p>
-            <w:r>
-              <w:t>Qwen3-Coder 30B-A3B Q8_0 (MoE)</w:t>
-            </w:r>
-          </w:p>
-        </w:tc>
-        <w:tc>
-          <w:tcPr>
-            <w:tcW w:type="dxa" w:w="1728"/>
-          </w:tcPr>
-          <w:p>
-            <w:r>
-              <w:t>shipped build</w:t>
-            </w:r>
-          </w:p>
-        </w:tc>
-        <w:tc>
-          <w:tcPr>
-            <w:tcW w:type="dxa" w:w="1728"/>
-          </w:tcPr>
-          <w:p>
-            <w:r>
-              <w:t>PASS</w:t>
-            </w:r>
-          </w:p>
-        </w:tc>
-        <w:tc>
-          <w:tcPr>
-            <w:tcW w:type="dxa" w:w="1728"/>
-          </w:tcPr>
-          <w:p>
-            <w:r>
-              <w:t>image tool used: yes</w:t>
-            </w:r>
-          </w:p>
-        </w:tc>
-      </w:tr>
-      <w:tr>
-        <w:tc>
-          <w:tcPr>
-            <w:tcW w:type="dxa" w:w="1728"/>
-          </w:tcPr>
-          <w:p>
-            <w:r>
-              <w:t>Full loop: game + own picture + screenshot</w:t>
-            </w:r>
-          </w:p>
-        </w:tc>
-        <w:tc>
-          <w:tcPr>
-            <w:tcW w:type="dxa" w:w="1728"/>
-          </w:tcPr>
-          <w:p>
-            <w:r>
-              <w:t>Qwen3-Coder-Next 80B Q8_0 (MoE)</w:t>
-            </w:r>
-          </w:p>
-        </w:tc>
-        <w:tc>
-          <w:tcPr>
-            <w:tcW w:type="dxa" w:w="1728"/>
-          </w:tcPr>
-          <w:p>
-            <w:r>
-              <w:t>fixed build</w:t>
-            </w:r>
-          </w:p>
-        </w:tc>
-        <w:tc>
-          <w:tcPr>
-            <w:tcW w:type="dxa" w:w="1728"/>
-          </w:tcPr>
-          <w:p>
-            <w:r>
-              <w:t>fail</w:t>
-            </w:r>
-          </w:p>
-        </w:tc>
-        <w:tc>
-          <w:tcPr>
-            <w:tcW w:type="dxa" w:w="1728"/>
-          </w:tcPr>
-          <w:p>
-            <w:r>
-              <w:t>image tool used: no; game works: yes</w:t>
-            </w:r>
-          </w:p>
-        </w:tc>
-      </w:tr>
-    </w:tbl>
-    <w:p/>
-    <w:p>
-      <w:pPr>
-        <w:pStyle w:val="Heading1"/>
-      </w:pPr>
-      <w:r>
         <w:t>How each task was graded</w:t>
       </w:r>
     </w:p>
@@ -3736,7 +2387,7 @@
         <w:pStyle w:val="ListBullet"/>
       </w:pPr>
       <w:r>
-        <w:t>Corrected 2026-10-20. Checking the grader by hand found six grader mistakes, all fixed, and EVERY row of both runs was graded again from the files the tools left behind (no tool run was repeated or edited). First three: a Godot project in a subfolder was opened in the wrong place, a Python virtual environment with an unusual name was not skipped, and a Python app was not always started with the agent's own run instruction. Then three more: (1) in a notes app the grader typed a note and only then pressed "New Note", which threw the note away — it now presses New first and closes the window with its close button; (2) it waited about 4 seconds before playing a 2D game, by which time a fast game was already over — it now also plays from the first frame; (3) its key presses lasted a millisecond, too short for games that check whether a key is held — keys are now held 0.15 s. Every change these fixes made was from fail to pass: opencode 2, Qwen Code 2, Qore Code 2 in the three-tool table, and Qore Code 2 in the fixed-build table. The first published version of this report (2026-10-19) had 12 / 7 / 7.</w:t>
+        <w:t xml:space="preserve">Every row was graded from the files the tools left behind, with the same grader for all three tools; no tool run was repeated or edited.</w:t>
       </w:r>
     </w:p>
     <w:p>
@@ -3761,14 +2412,6 @@
       </w:pPr>
       <w:r>
         <w:t>We did not find a 70B dense coding model with tool calling in Ollama's model library, so the 70B dense model is Llama 3.3 70B Instruct Q8_0, a general model. All three tools struggled with it, mostly writing nothing.</w:t>
-      </w:r>
-    </w:p>
-    <w:p>
-      <w:pPr>
-        <w:pStyle w:val="ListBullet"/>
-      </w:pPr>
-      <w:r>
-        <w:t>Where Qore Code still fails, why (from its own run logs), and what we are fixing next: ROADMAP.md in the same repository.</w:t>
       </w:r>
     </w:p>
     <w:p>

</xml_diff>